<commit_message>
Free templates: Legal desk fixes and design round 1 fixes (still drafts)
Co-Authored-By: Claude Opus 5.5 <noreply@anthropic.com>
Claude-Session: https://claude.ai/code/session_0122otiWoh8gJECjGVg2FuAQ
</commit_message>
<xml_diff>
--- a/docs/downloads/price-increase-letter-template.docx
+++ b/docs/downloads/price-increase-letter-template.docx
@@ -97,7 +97,7 @@
           <w:b w:val="0"/>
           <w:sz w:val="21"/>
         </w:rPr>
-        <w:t>In the Word file, search for [ to find each field. Delete any Optional line you don't use, and the version note at the top of the page.</w:t>
+        <w:t>In the Word file, search for [ to find each field. Delete any Optional line you don't use, and the version box at the top of the page.</w:t>
       </w:r>
     </w:p>
     <w:p>
@@ -348,18 +348,52 @@
         <w:br w:type="page"/>
       </w:r>
     </w:p>
+    <w:tbl>
+      <w:tblPr>
+        <w:tblW w:type="auto" w:w="0"/>
+        <w:tblLook w:firstColumn="1" w:firstRow="1" w:lastColumn="0" w:lastRow="0" w:noHBand="0" w:noVBand="1" w:val="04A0"/>
+      </w:tblPr>
+      <w:tblGrid>
+        <w:gridCol w:w="9360"/>
+      </w:tblGrid>
+      <w:tr>
+        <w:tc>
+          <w:tcPr>
+            <w:tcW w:type="dxa" w:w="9360"/>
+            <w:tcBorders>
+              <w:top w:val="single" w:sz="6" w:color="E2DDD3"/>
+              <w:left w:val="single" w:sz="6" w:color="E2DDD3"/>
+              <w:bottom w:val="single" w:sz="6" w:color="E2DDD3"/>
+              <w:right w:val="single" w:sz="6" w:color="E2DDD3"/>
+            </w:tcBorders>
+            <w:shd w:val="clear" w:color="auto" w:fill="FAF8F4"/>
+          </w:tcPr>
+          <w:p>
+            <w:pPr>
+              <w:spacing w:after="40" w:before="40"/>
+            </w:pPr>
+            <w:r>
+              <w:rPr>
+                <w:b/>
+                <w:sz w:val="17"/>
+              </w:rPr>
+              <w:t xml:space="preserve">Version 1 of 3: Standard notice. </w:t>
+            </w:r>
+            <w:r>
+              <w:rPr>
+                <w:color w:val="5C6270"/>
+                <w:sz w:val="17"/>
+              </w:rPr>
+              <w:t>For most customers. Short, clear, and it answers the questions people ask first: how much, from when, and what stays the same. Delete this box before you send.</w:t>
+            </w:r>
+          </w:p>
+        </w:tc>
+      </w:tr>
+    </w:tbl>
     <w:p>
       <w:pPr>
-        <w:spacing w:after="280"/>
+        <w:spacing w:after="120"/>
       </w:pPr>
-      <w:r>
-        <w:rPr>
-          <w:b w:val="0"/>
-          <w:color w:val="5C6270"/>
-          <w:sz w:val="17"/>
-        </w:rPr>
-        <w:t>Version 1 of 3: Standard notice. For most customers. Short, clear, and it answers the questions people ask first: how much, from when, and what stays the same. Delete this note before you send.</w:t>
-      </w:r>
     </w:p>
     <w:p>
       <w:pPr>
@@ -367,7 +401,9 @@
       </w:pPr>
       <w:r>
         <w:rPr>
-          <w:b w:val="0"/>
+          <w:b/>
+          <w:color w:val="1F4E9E"/>
+          <w:shd w:val="clear" w:color="auto" w:fill="FDF6DC"/>
         </w:rPr>
         <w:t>[Your business name]</w:t>
       </w:r>
@@ -378,10 +414,28 @@
       </w:pPr>
       <w:r>
         <w:rPr>
-          <w:b w:val="0"/>
+          <w:b/>
+          <w:color w:val="1F4E9E"/>
+          <w:shd w:val="clear" w:color="auto" w:fill="FDF6DC"/>
         </w:rPr>
-        <w:t>[Phone]  |  [Email]</w:t>
+        <w:t>[Phone]</w:t>
       </w:r>
+      <w:r>
+        <w:t xml:space="preserve">  |  </w:t>
+      </w:r>
+      <w:r>
+        <w:rPr>
+          <w:b/>
+          <w:color w:val="1F4E9E"/>
+          <w:shd w:val="clear" w:color="auto" w:fill="FDF6DC"/>
+        </w:rPr>
+        <w:t>[Email]</w:t>
+      </w:r>
+    </w:p>
+    <w:p>
+      <w:pPr>
+        <w:spacing w:after="0"/>
+      </w:pPr>
     </w:p>
     <w:p>
       <w:pPr>
@@ -389,17 +443,9 @@
       </w:pPr>
       <w:r>
         <w:rPr>
-          <w:b w:val="0"/>
-        </w:rPr>
-      </w:r>
-    </w:p>
-    <w:p>
-      <w:pPr>
-        <w:spacing w:after="0"/>
-      </w:pPr>
-      <w:r>
-        <w:rPr>
-          <w:b w:val="0"/>
+          <w:b/>
+          <w:color w:val="1F4E9E"/>
+          <w:shd w:val="clear" w:color="auto" w:fill="FDF6DC"/>
         </w:rPr>
         <w:t>[Date]</w:t>
       </w:r>
@@ -408,10 +454,24 @@
       <w:pPr>
         <w:spacing w:after="0"/>
       </w:pPr>
+    </w:p>
+    <w:p>
+      <w:pPr>
+        <w:spacing w:after="200"/>
+      </w:pPr>
+      <w:r>
+        <w:t xml:space="preserve">Dear </w:t>
+      </w:r>
       <w:r>
         <w:rPr>
-          <w:b w:val="0"/>
+          <w:b/>
+          <w:color w:val="1F4E9E"/>
+          <w:shd w:val="clear" w:color="auto" w:fill="FDF6DC"/>
         </w:rPr>
+        <w:t>[Customer first name]</w:t>
+      </w:r>
+      <w:r>
+        <w:t>,</w:t>
       </w:r>
     </w:p>
     <w:p>
@@ -419,10 +479,29 @@
         <w:spacing w:after="200"/>
       </w:pPr>
       <w:r>
+        <w:t xml:space="preserve">Thank you for choosing </w:t>
+      </w:r>
+      <w:r>
         <w:rPr>
-          <w:b w:val="0"/>
+          <w:b/>
+          <w:color w:val="1F4E9E"/>
+          <w:shd w:val="clear" w:color="auto" w:fill="FDF6DC"/>
         </w:rPr>
-        <w:t>Dear [Customer first name],</w:t>
+        <w:t>[Your business name]</w:t>
+      </w:r>
+      <w:r>
+        <w:t xml:space="preserve"> for your </w:t>
+      </w:r>
+      <w:r>
+        <w:rPr>
+          <w:b/>
+          <w:color w:val="1F4E9E"/>
+          <w:shd w:val="clear" w:color="auto" w:fill="FDF6DC"/>
+        </w:rPr>
+        <w:t>[service, for example every-other-week house cleaning]</w:t>
+      </w:r>
+      <w:r>
+        <w:t>.</w:t>
       </w:r>
     </w:p>
     <w:p>
@@ -430,10 +509,73 @@
         <w:spacing w:after="200"/>
       </w:pPr>
       <w:r>
+        <w:t xml:space="preserve">Starting </w:t>
+      </w:r>
+      <w:r>
         <w:rPr>
-          <w:b w:val="0"/>
+          <w:b/>
+          <w:color w:val="1F4E9E"/>
+          <w:shd w:val="clear" w:color="auto" w:fill="FDF6DC"/>
         </w:rPr>
-        <w:t>Thank you for choosing [Your business name] for your [service, for example every-other-week house cleaning].</w:t>
+        <w:t>[effective date]</w:t>
+      </w:r>
+      <w:r>
+        <w:t xml:space="preserve">, the price of your </w:t>
+      </w:r>
+      <w:r>
+        <w:rPr>
+          <w:b/>
+          <w:color w:val="1F4E9E"/>
+          <w:shd w:val="clear" w:color="auto" w:fill="FDF6DC"/>
+        </w:rPr>
+        <w:t>[service]</w:t>
+      </w:r>
+      <w:r>
+        <w:t xml:space="preserve"> will change from </w:t>
+      </w:r>
+      <w:r>
+        <w:rPr>
+          <w:b/>
+          <w:color w:val="1F4E9E"/>
+          <w:shd w:val="clear" w:color="auto" w:fill="FDF6DC"/>
+        </w:rPr>
+        <w:t>[old price]</w:t>
+      </w:r>
+      <w:r>
+        <w:t xml:space="preserve"> to </w:t>
+      </w:r>
+      <w:r>
+        <w:rPr>
+          <w:b/>
+          <w:color w:val="1F4E9E"/>
+          <w:shd w:val="clear" w:color="auto" w:fill="FDF6DC"/>
+        </w:rPr>
+        <w:t>[new price]</w:t>
+      </w:r>
+      <w:r>
+        <w:t xml:space="preserve"> per </w:t>
+      </w:r>
+      <w:r>
+        <w:rPr>
+          <w:b/>
+          <w:color w:val="1F4E9E"/>
+          <w:shd w:val="clear" w:color="auto" w:fill="FDF6DC"/>
+        </w:rPr>
+        <w:t>[visit, month or job]</w:t>
+      </w:r>
+      <w:r>
+        <w:t xml:space="preserve">. Everything else stays the same: the same </w:t>
+      </w:r>
+      <w:r>
+        <w:rPr>
+          <w:b/>
+          <w:color w:val="1F4E9E"/>
+          <w:shd w:val="clear" w:color="auto" w:fill="FDF6DC"/>
+        </w:rPr>
+        <w:t>[team, day and checklist]</w:t>
+      </w:r>
+      <w:r>
+        <w:t>.</w:t>
       </w:r>
     </w:p>
     <w:p>
@@ -441,10 +583,26 @@
         <w:spacing w:after="200"/>
       </w:pPr>
       <w:r>
+        <w:t xml:space="preserve">We review our prices </w:t>
+      </w:r>
+      <w:r>
         <w:rPr>
-          <w:b w:val="0"/>
+          <w:b/>
+          <w:color w:val="1F4E9E"/>
+          <w:shd w:val="clear" w:color="auto" w:fill="FDF6DC"/>
         </w:rPr>
-        <w:t>Starting [effective date], the price of your [service] will change from [old price] to [new price] per [visit, month or job]. Everything else stays the same: the same [team, day and checklist].</w:t>
+        <w:t>[once a year]</w:t>
+      </w:r>
+      <w:r>
+        <w:t xml:space="preserve"> so we can keep paying our team fairly and keep doing the work the way you expect. </w:t>
+      </w:r>
+      <w:r>
+        <w:rPr>
+          <w:b/>
+          <w:color w:val="1F4E9E"/>
+          <w:shd w:val="clear" w:color="auto" w:fill="FDF6DC"/>
+        </w:rPr>
+        <w:t>[Optional: This is our first price change since (year).]</w:t>
       </w:r>
     </w:p>
     <w:p>
@@ -452,10 +610,51 @@
         <w:spacing w:after="200"/>
       </w:pPr>
       <w:r>
+        <w:t xml:space="preserve">Any </w:t>
+      </w:r>
+      <w:r>
         <w:rPr>
-          <w:b w:val="0"/>
+          <w:b/>
+          <w:color w:val="1F4E9E"/>
+          <w:shd w:val="clear" w:color="auto" w:fill="FDF6DC"/>
         </w:rPr>
-        <w:t>We review our prices [once a year] so we can keep paying our team fairly and keep doing the work the way you expect. [Optional: This is our first price change since (year).]</w:t>
+        <w:t>[visits]</w:t>
+      </w:r>
+      <w:r>
+        <w:t xml:space="preserve"> before </w:t>
+      </w:r>
+      <w:r>
+        <w:rPr>
+          <w:b/>
+          <w:color w:val="1F4E9E"/>
+          <w:shd w:val="clear" w:color="auto" w:fill="FDF6DC"/>
+        </w:rPr>
+        <w:t>[effective date]</w:t>
+      </w:r>
+      <w:r>
+        <w:t xml:space="preserve"> stay at your current price. If you have questions, call or text me at </w:t>
+      </w:r>
+      <w:r>
+        <w:rPr>
+          <w:b/>
+          <w:color w:val="1F4E9E"/>
+          <w:shd w:val="clear" w:color="auto" w:fill="FDF6DC"/>
+        </w:rPr>
+        <w:t>[phone]</w:t>
+      </w:r>
+      <w:r>
+        <w:t xml:space="preserve"> or reply to this </w:t>
+      </w:r>
+      <w:r>
+        <w:rPr>
+          <w:b/>
+          <w:color w:val="1F4E9E"/>
+          <w:shd w:val="clear" w:color="auto" w:fill="FDF6DC"/>
+        </w:rPr>
+        <w:t>[email]</w:t>
+      </w:r>
+      <w:r>
+        <w:t>.</w:t>
       </w:r>
     </w:p>
     <w:p>
@@ -463,20 +662,6 @@
         <w:spacing w:after="200"/>
       </w:pPr>
       <w:r>
-        <w:rPr>
-          <w:b w:val="0"/>
-        </w:rPr>
-        <w:t>Any [visits] before [effective date] stay at your current price. If you have questions, call or text me at [phone] or reply to this [email].</w:t>
-      </w:r>
-    </w:p>
-    <w:p>
-      <w:pPr>
-        <w:spacing w:after="200"/>
-      </w:pPr>
-      <w:r>
-        <w:rPr>
-          <w:b w:val="0"/>
-        </w:rPr>
         <w:t>Thank you for your business.</w:t>
       </w:r>
     </w:p>
@@ -496,7 +681,9 @@
       </w:pPr>
       <w:r>
         <w:rPr>
-          <w:b w:val="0"/>
+          <w:b/>
+          <w:color w:val="1F4E9E"/>
+          <w:shd w:val="clear" w:color="auto" w:fill="FDF6DC"/>
         </w:rPr>
         <w:t>[Your name]</w:t>
       </w:r>
@@ -507,7 +694,9 @@
       </w:pPr>
       <w:r>
         <w:rPr>
-          <w:b w:val="0"/>
+          <w:b/>
+          <w:color w:val="1F4E9E"/>
+          <w:shd w:val="clear" w:color="auto" w:fill="FDF6DC"/>
         </w:rPr>
         <w:t>[Your business name]</w:t>
       </w:r>
@@ -515,18 +704,52 @@
         <w:br w:type="page"/>
       </w:r>
     </w:p>
+    <w:tbl>
+      <w:tblPr>
+        <w:tblW w:type="auto" w:w="0"/>
+        <w:tblLook w:firstColumn="1" w:firstRow="1" w:lastColumn="0" w:lastRow="0" w:noHBand="0" w:noVBand="1" w:val="04A0"/>
+      </w:tblPr>
+      <w:tblGrid>
+        <w:gridCol w:w="9360"/>
+      </w:tblGrid>
+      <w:tr>
+        <w:tc>
+          <w:tcPr>
+            <w:tcW w:type="dxa" w:w="9360"/>
+            <w:tcBorders>
+              <w:top w:val="single" w:sz="6" w:color="E2DDD3"/>
+              <w:left w:val="single" w:sz="6" w:color="E2DDD3"/>
+              <w:bottom w:val="single" w:sz="6" w:color="E2DDD3"/>
+              <w:right w:val="single" w:sz="6" w:color="E2DDD3"/>
+            </w:tcBorders>
+            <w:shd w:val="clear" w:color="auto" w:fill="FAF8F4"/>
+          </w:tcPr>
+          <w:p>
+            <w:pPr>
+              <w:spacing w:after="40" w:before="40"/>
+            </w:pPr>
+            <w:r>
+              <w:rPr>
+                <w:b/>
+                <w:sz w:val="17"/>
+              </w:rPr>
+              <w:t xml:space="preserve">Version 2 of 3: Long-time customer. </w:t>
+            </w:r>
+            <w:r>
+              <w:rPr>
+                <w:color w:val="5C6270"/>
+                <w:sz w:val="17"/>
+              </w:rPr>
+              <w:t>For customers who have been with you for years. It thanks them first and gives them something for staying: a later start date or a small loyalty discount. Delete this box before you send.</w:t>
+            </w:r>
+          </w:p>
+        </w:tc>
+      </w:tr>
+    </w:tbl>
     <w:p>
       <w:pPr>
-        <w:spacing w:after="280"/>
+        <w:spacing w:after="120"/>
       </w:pPr>
-      <w:r>
-        <w:rPr>
-          <w:b w:val="0"/>
-          <w:color w:val="5C6270"/>
-          <w:sz w:val="17"/>
-        </w:rPr>
-        <w:t>Version 2 of 3: Long-time customer. For customers who have been with you for years. It thanks them first and gives them something for staying: a later start date or a small loyalty discount. Delete this note before you send.</w:t>
-      </w:r>
     </w:p>
     <w:p>
       <w:pPr>
@@ -534,7 +757,9 @@
       </w:pPr>
       <w:r>
         <w:rPr>
-          <w:b w:val="0"/>
+          <w:b/>
+          <w:color w:val="1F4E9E"/>
+          <w:shd w:val="clear" w:color="auto" w:fill="FDF6DC"/>
         </w:rPr>
         <w:t>[Your business name]</w:t>
       </w:r>
@@ -545,10 +770,28 @@
       </w:pPr>
       <w:r>
         <w:rPr>
-          <w:b w:val="0"/>
+          <w:b/>
+          <w:color w:val="1F4E9E"/>
+          <w:shd w:val="clear" w:color="auto" w:fill="FDF6DC"/>
         </w:rPr>
-        <w:t>[Phone]  |  [Email]</w:t>
+        <w:t>[Phone]</w:t>
       </w:r>
+      <w:r>
+        <w:t xml:space="preserve">  |  </w:t>
+      </w:r>
+      <w:r>
+        <w:rPr>
+          <w:b/>
+          <w:color w:val="1F4E9E"/>
+          <w:shd w:val="clear" w:color="auto" w:fill="FDF6DC"/>
+        </w:rPr>
+        <w:t>[Email]</w:t>
+      </w:r>
+    </w:p>
+    <w:p>
+      <w:pPr>
+        <w:spacing w:after="0"/>
+      </w:pPr>
     </w:p>
     <w:p>
       <w:pPr>
@@ -556,17 +799,9 @@
       </w:pPr>
       <w:r>
         <w:rPr>
-          <w:b w:val="0"/>
-        </w:rPr>
-      </w:r>
-    </w:p>
-    <w:p>
-      <w:pPr>
-        <w:spacing w:after="0"/>
-      </w:pPr>
-      <w:r>
-        <w:rPr>
-          <w:b w:val="0"/>
+          <w:b/>
+          <w:color w:val="1F4E9E"/>
+          <w:shd w:val="clear" w:color="auto" w:fill="FDF6DC"/>
         </w:rPr>
         <w:t>[Date]</w:t>
       </w:r>
@@ -575,10 +810,24 @@
       <w:pPr>
         <w:spacing w:after="0"/>
       </w:pPr>
+    </w:p>
+    <w:p>
+      <w:pPr>
+        <w:spacing w:after="200"/>
+      </w:pPr>
+      <w:r>
+        <w:t xml:space="preserve">Dear </w:t>
+      </w:r>
       <w:r>
         <w:rPr>
-          <w:b w:val="0"/>
+          <w:b/>
+          <w:color w:val="1F4E9E"/>
+          <w:shd w:val="clear" w:color="auto" w:fill="FDF6DC"/>
         </w:rPr>
+        <w:t>[Customer first name]</w:t>
+      </w:r>
+      <w:r>
+        <w:t>,</w:t>
       </w:r>
     </w:p>
     <w:p>
@@ -586,10 +835,26 @@
         <w:spacing w:after="200"/>
       </w:pPr>
       <w:r>
+        <w:t xml:space="preserve">You have been with us since </w:t>
+      </w:r>
+      <w:r>
         <w:rPr>
-          <w:b w:val="0"/>
+          <w:b/>
+          <w:color w:val="1F4E9E"/>
+          <w:shd w:val="clear" w:color="auto" w:fill="FDF6DC"/>
         </w:rPr>
-        <w:t>Dear [Customer first name],</w:t>
+        <w:t>[year]</w:t>
+      </w:r>
+      <w:r>
+        <w:t xml:space="preserve">, and we don't take that for granted. </w:t>
+      </w:r>
+      <w:r>
+        <w:rPr>
+          <w:b/>
+          <w:color w:val="1F4E9E"/>
+          <w:shd w:val="clear" w:color="auto" w:fill="FDF6DC"/>
+        </w:rPr>
+        <w:t>[Optional: a personal thank-you, for example: Thank you for always making room for us on short notice.]</w:t>
       </w:r>
     </w:p>
     <w:p>
@@ -597,10 +862,70 @@
         <w:spacing w:after="200"/>
       </w:pPr>
       <w:r>
+        <w:t xml:space="preserve">I wanted you to hear this from me first. Starting </w:t>
+      </w:r>
+      <w:r>
         <w:rPr>
-          <w:b w:val="0"/>
+          <w:b/>
+          <w:color w:val="1F4E9E"/>
+          <w:shd w:val="clear" w:color="auto" w:fill="FDF6DC"/>
         </w:rPr>
-        <w:t>You have been with us since [year], and we don't take that for granted. [Optional: a personal thank-you, for example: Thank you for always making room for us on short notice.]</w:t>
+        <w:t>[effective date]</w:t>
+      </w:r>
+      <w:r>
+        <w:t xml:space="preserve">, the price of your </w:t>
+      </w:r>
+      <w:r>
+        <w:rPr>
+          <w:b/>
+          <w:color w:val="1F4E9E"/>
+          <w:shd w:val="clear" w:color="auto" w:fill="FDF6DC"/>
+        </w:rPr>
+        <w:t>[service]</w:t>
+      </w:r>
+      <w:r>
+        <w:t xml:space="preserve"> will go from </w:t>
+      </w:r>
+      <w:r>
+        <w:rPr>
+          <w:b/>
+          <w:color w:val="1F4E9E"/>
+          <w:shd w:val="clear" w:color="auto" w:fill="FDF6DC"/>
+        </w:rPr>
+        <w:t>[old price]</w:t>
+      </w:r>
+      <w:r>
+        <w:t xml:space="preserve"> to </w:t>
+      </w:r>
+      <w:r>
+        <w:rPr>
+          <w:b/>
+          <w:color w:val="1F4E9E"/>
+          <w:shd w:val="clear" w:color="auto" w:fill="FDF6DC"/>
+        </w:rPr>
+        <w:t>[new price]</w:t>
+      </w:r>
+      <w:r>
+        <w:t xml:space="preserve"> per </w:t>
+      </w:r>
+      <w:r>
+        <w:rPr>
+          <w:b/>
+          <w:color w:val="1F4E9E"/>
+          <w:shd w:val="clear" w:color="auto" w:fill="FDF6DC"/>
+        </w:rPr>
+        <w:t>[visit]</w:t>
+      </w:r>
+      <w:r>
+        <w:t xml:space="preserve">. </w:t>
+      </w:r>
+      <w:r>
+        <w:rPr>
+          <w:b/>
+          <w:color w:val="1F4E9E"/>
+          <w:shd w:val="clear" w:color="auto" w:fill="FDF6DC"/>
+        </w:rPr>
+        <w:t>[Optional: It is the first change to your price in (number) years.]</w:t>
       </w:r>
     </w:p>
     <w:p>
@@ -608,10 +933,18 @@
         <w:spacing w:after="200"/>
       </w:pPr>
       <w:r>
+        <w:t xml:space="preserve">Because you have been with us so long, </w:t>
+      </w:r>
+      <w:r>
         <w:rPr>
-          <w:b w:val="0"/>
+          <w:b/>
+          <w:color w:val="1F4E9E"/>
+          <w:shd w:val="clear" w:color="auto" w:fill="FDF6DC"/>
         </w:rPr>
-        <w:t>I wanted you to hear this from me first. Starting [effective date], the price of your [service] will go from [old price] to [new price] per [visit]. [Optional: It is the first change to your price in (number) years.]</w:t>
+        <w:t>[pick one and delete the other: your new price won't start until (later date) / we are keeping a (dollar amount) loyalty discount on your new price]</w:t>
+      </w:r>
+      <w:r>
+        <w:t>.</w:t>
       </w:r>
     </w:p>
     <w:p>
@@ -619,10 +952,29 @@
         <w:spacing w:after="200"/>
       </w:pPr>
       <w:r>
+        <w:t xml:space="preserve">Nothing else changes. Same </w:t>
+      </w:r>
+      <w:r>
         <w:rPr>
-          <w:b w:val="0"/>
+          <w:b/>
+          <w:color w:val="1F4E9E"/>
+          <w:shd w:val="clear" w:color="auto" w:fill="FDF6DC"/>
         </w:rPr>
-        <w:t>Because you have been with us so long, [pick one and delete the other: your new price won't start until (later date) / we are keeping a (dollar amount) loyalty discount on your new price].</w:t>
+        <w:t>[team]</w:t>
+      </w:r>
+      <w:r>
+        <w:t xml:space="preserve">, same </w:t>
+      </w:r>
+      <w:r>
+        <w:rPr>
+          <w:b/>
+          <w:color w:val="1F4E9E"/>
+          <w:shd w:val="clear" w:color="auto" w:fill="FDF6DC"/>
+        </w:rPr>
+        <w:t>[day]</w:t>
+      </w:r>
+      <w:r>
+        <w:t>, same care.</w:t>
       </w:r>
     </w:p>
     <w:p>
@@ -630,21 +982,29 @@
         <w:spacing w:after="200"/>
       </w:pPr>
       <w:r>
-        <w:rPr>
-          <w:b w:val="0"/>
-        </w:rPr>
-        <w:t>Nothing else changes. Same [team], same [day], same care.</w:t>
+        <w:t xml:space="preserve">If you would like to talk it over, call me at </w:t>
       </w:r>
-    </w:p>
-    <w:p>
-      <w:pPr>
-        <w:spacing w:after="200"/>
-      </w:pPr>
       <w:r>
         <w:rPr>
-          <w:b w:val="0"/>
+          <w:b/>
+          <w:color w:val="1F4E9E"/>
+          <w:shd w:val="clear" w:color="auto" w:fill="FDF6DC"/>
         </w:rPr>
-        <w:t>If you would like to talk it over, call me at [phone]. Thank you for [number] years.</w:t>
+        <w:t>[phone]</w:t>
+      </w:r>
+      <w:r>
+        <w:t xml:space="preserve">. Thank you for </w:t>
+      </w:r>
+      <w:r>
+        <w:rPr>
+          <w:b/>
+          <w:color w:val="1F4E9E"/>
+          <w:shd w:val="clear" w:color="auto" w:fill="FDF6DC"/>
+        </w:rPr>
+        <w:t>[number]</w:t>
+      </w:r>
+      <w:r>
+        <w:t xml:space="preserve"> years.</w:t>
       </w:r>
     </w:p>
     <w:p>
@@ -663,7 +1023,9 @@
       </w:pPr>
       <w:r>
         <w:rPr>
-          <w:b w:val="0"/>
+          <w:b/>
+          <w:color w:val="1F4E9E"/>
+          <w:shd w:val="clear" w:color="auto" w:fill="FDF6DC"/>
         </w:rPr>
         <w:t>[Your name]</w:t>
       </w:r>
@@ -674,7 +1036,9 @@
       </w:pPr>
       <w:r>
         <w:rPr>
-          <w:b w:val="0"/>
+          <w:b/>
+          <w:color w:val="1F4E9E"/>
+          <w:shd w:val="clear" w:color="auto" w:fill="FDF6DC"/>
         </w:rPr>
         <w:t>[Your business name]</w:t>
       </w:r>
@@ -682,18 +1046,52 @@
         <w:br w:type="page"/>
       </w:r>
     </w:p>
+    <w:tbl>
+      <w:tblPr>
+        <w:tblW w:type="auto" w:w="0"/>
+        <w:tblLook w:firstColumn="1" w:firstRow="1" w:lastColumn="0" w:lastRow="0" w:noHBand="0" w:noVBand="1" w:val="04A0"/>
+      </w:tblPr>
+      <w:tblGrid>
+        <w:gridCol w:w="9360"/>
+      </w:tblGrid>
+      <w:tr>
+        <w:tc>
+          <w:tcPr>
+            <w:tcW w:type="dxa" w:w="9360"/>
+            <w:tcBorders>
+              <w:top w:val="single" w:sz="6" w:color="E2DDD3"/>
+              <w:left w:val="single" w:sz="6" w:color="E2DDD3"/>
+              <w:bottom w:val="single" w:sz="6" w:color="E2DDD3"/>
+              <w:right w:val="single" w:sz="6" w:color="E2DDD3"/>
+            </w:tcBorders>
+            <w:shd w:val="clear" w:color="auto" w:fill="FAF8F4"/>
+          </w:tcPr>
+          <w:p>
+            <w:pPr>
+              <w:spacing w:after="40" w:before="40"/>
+            </w:pPr>
+            <w:r>
+              <w:rPr>
+                <w:b/>
+                <w:sz w:val="17"/>
+              </w:rPr>
+              <w:t xml:space="preserve">Version 3 of 3: Rising costs. </w:t>
+            </w:r>
+            <w:r>
+              <w:rPr>
+                <w:color w:val="5C6270"/>
+                <w:sz w:val="17"/>
+              </w:rPr>
+              <w:t>When one cost, such as fuel, supplies, insurance or labor, is the reason. It names the cost and shows the change in dollars. Delete this box before you send.</w:t>
+            </w:r>
+          </w:p>
+        </w:tc>
+      </w:tr>
+    </w:tbl>
     <w:p>
       <w:pPr>
-        <w:spacing w:after="280"/>
+        <w:spacing w:after="120"/>
       </w:pPr>
-      <w:r>
-        <w:rPr>
-          <w:b w:val="0"/>
-          <w:color w:val="5C6270"/>
-          <w:sz w:val="17"/>
-        </w:rPr>
-        <w:t>Version 3 of 3: Rising costs. When one cost, such as fuel, supplies, insurance or labor, is the reason. It names the cost and shows the change in dollars. Delete this note before you send.</w:t>
-      </w:r>
     </w:p>
     <w:p>
       <w:pPr>
@@ -701,7 +1099,9 @@
       </w:pPr>
       <w:r>
         <w:rPr>
-          <w:b w:val="0"/>
+          <w:b/>
+          <w:color w:val="1F4E9E"/>
+          <w:shd w:val="clear" w:color="auto" w:fill="FDF6DC"/>
         </w:rPr>
         <w:t>[Your business name]</w:t>
       </w:r>
@@ -712,10 +1112,28 @@
       </w:pPr>
       <w:r>
         <w:rPr>
-          <w:b w:val="0"/>
+          <w:b/>
+          <w:color w:val="1F4E9E"/>
+          <w:shd w:val="clear" w:color="auto" w:fill="FDF6DC"/>
         </w:rPr>
-        <w:t>[Phone]  |  [Email]</w:t>
+        <w:t>[Phone]</w:t>
       </w:r>
+      <w:r>
+        <w:t xml:space="preserve">  |  </w:t>
+      </w:r>
+      <w:r>
+        <w:rPr>
+          <w:b/>
+          <w:color w:val="1F4E9E"/>
+          <w:shd w:val="clear" w:color="auto" w:fill="FDF6DC"/>
+        </w:rPr>
+        <w:t>[Email]</w:t>
+      </w:r>
+    </w:p>
+    <w:p>
+      <w:pPr>
+        <w:spacing w:after="0"/>
+      </w:pPr>
     </w:p>
     <w:p>
       <w:pPr>
@@ -723,17 +1141,9 @@
       </w:pPr>
       <w:r>
         <w:rPr>
-          <w:b w:val="0"/>
-        </w:rPr>
-      </w:r>
-    </w:p>
-    <w:p>
-      <w:pPr>
-        <w:spacing w:after="0"/>
-      </w:pPr>
-      <w:r>
-        <w:rPr>
-          <w:b w:val="0"/>
+          <w:b/>
+          <w:color w:val="1F4E9E"/>
+          <w:shd w:val="clear" w:color="auto" w:fill="FDF6DC"/>
         </w:rPr>
         <w:t>[Date]</w:t>
       </w:r>
@@ -742,10 +1152,169 @@
       <w:pPr>
         <w:spacing w:after="0"/>
       </w:pPr>
+    </w:p>
+    <w:p>
+      <w:pPr>
+        <w:spacing w:after="200"/>
+      </w:pPr>
+      <w:r>
+        <w:t xml:space="preserve">Dear </w:t>
+      </w:r>
       <w:r>
         <w:rPr>
-          <w:b w:val="0"/>
+          <w:b/>
+          <w:color w:val="1F4E9E"/>
+          <w:shd w:val="clear" w:color="auto" w:fill="FDF6DC"/>
         </w:rPr>
+        <w:t>[Customer first name]</w:t>
+      </w:r>
+      <w:r>
+        <w:t>,</w:t>
+      </w:r>
+    </w:p>
+    <w:p>
+      <w:pPr>
+        <w:spacing w:after="200"/>
+      </w:pPr>
+      <w:r>
+        <w:t>I'm writing to let you know about a change to our prices, and the reason for it.</w:t>
+      </w:r>
+    </w:p>
+    <w:p>
+      <w:pPr>
+        <w:spacing w:after="200"/>
+      </w:pPr>
+      <w:r>
+        <w:t xml:space="preserve">Over the past </w:t>
+      </w:r>
+      <w:r>
+        <w:rPr>
+          <w:b/>
+          <w:color w:val="1F4E9E"/>
+          <w:shd w:val="clear" w:color="auto" w:fill="FDF6DC"/>
+        </w:rPr>
+        <w:t>[12 months]</w:t>
+      </w:r>
+      <w:r>
+        <w:t xml:space="preserve">, what we pay for </w:t>
+      </w:r>
+      <w:r>
+        <w:rPr>
+          <w:b/>
+          <w:color w:val="1F4E9E"/>
+          <w:shd w:val="clear" w:color="auto" w:fill="FDF6DC"/>
+        </w:rPr>
+        <w:t>[supplies, fuel, insurance or labor]</w:t>
+      </w:r>
+      <w:r>
+        <w:t xml:space="preserve"> has gone up. </w:t>
+      </w:r>
+      <w:r>
+        <w:rPr>
+          <w:b/>
+          <w:color w:val="1F4E9E"/>
+          <w:shd w:val="clear" w:color="auto" w:fill="FDF6DC"/>
+        </w:rPr>
+        <w:t>[Optional: name the cost, for example: Our fuel bill went from about (old amount) to (new amount) a month.]</w:t>
+      </w:r>
+      <w:r>
+        <w:t xml:space="preserve"> We have covered the difference ourselves until now, but to keep </w:t>
+      </w:r>
+      <w:r>
+        <w:rPr>
+          <w:b/>
+          <w:color w:val="1F4E9E"/>
+          <w:shd w:val="clear" w:color="auto" w:fill="FDF6DC"/>
+        </w:rPr>
+        <w:t>[the same products, crew and schedule]</w:t>
+      </w:r>
+      <w:r>
+        <w:t xml:space="preserve"> on every visit, we need to adjust.</w:t>
+      </w:r>
+    </w:p>
+    <w:p>
+      <w:pPr>
+        <w:spacing w:after="200"/>
+      </w:pPr>
+      <w:r>
+        <w:t xml:space="preserve">Starting </w:t>
+      </w:r>
+      <w:r>
+        <w:rPr>
+          <w:b/>
+          <w:color w:val="1F4E9E"/>
+          <w:shd w:val="clear" w:color="auto" w:fill="FDF6DC"/>
+        </w:rPr>
+        <w:t>[effective date]</w:t>
+      </w:r>
+      <w:r>
+        <w:t xml:space="preserve">, your </w:t>
+      </w:r>
+      <w:r>
+        <w:rPr>
+          <w:b/>
+          <w:color w:val="1F4E9E"/>
+          <w:shd w:val="clear" w:color="auto" w:fill="FDF6DC"/>
+        </w:rPr>
+        <w:t>[service]</w:t>
+      </w:r>
+      <w:r>
+        <w:t xml:space="preserve"> will be </w:t>
+      </w:r>
+      <w:r>
+        <w:rPr>
+          <w:b/>
+          <w:color w:val="1F4E9E"/>
+          <w:shd w:val="clear" w:color="auto" w:fill="FDF6DC"/>
+        </w:rPr>
+        <w:t>[new price]</w:t>
+      </w:r>
+      <w:r>
+        <w:t xml:space="preserve"> per </w:t>
+      </w:r>
+      <w:r>
+        <w:rPr>
+          <w:b/>
+          <w:color w:val="1F4E9E"/>
+          <w:shd w:val="clear" w:color="auto" w:fill="FDF6DC"/>
+        </w:rPr>
+        <w:t>[visit]</w:t>
+      </w:r>
+      <w:r>
+        <w:t xml:space="preserve">, up from </w:t>
+      </w:r>
+      <w:r>
+        <w:rPr>
+          <w:b/>
+          <w:color w:val="1F4E9E"/>
+          <w:shd w:val="clear" w:color="auto" w:fill="FDF6DC"/>
+        </w:rPr>
+        <w:t>[old price]</w:t>
+      </w:r>
+      <w:r>
+        <w:t xml:space="preserve">. That is </w:t>
+      </w:r>
+      <w:r>
+        <w:rPr>
+          <w:b/>
+          <w:color w:val="1F4E9E"/>
+          <w:shd w:val="clear" w:color="auto" w:fill="FDF6DC"/>
+        </w:rPr>
+        <w:t>[difference]</w:t>
+      </w:r>
+      <w:r>
+        <w:t xml:space="preserve"> more per </w:t>
+      </w:r>
+      <w:r>
+        <w:rPr>
+          <w:b/>
+          <w:color w:val="1F4E9E"/>
+          <w:shd w:val="clear" w:color="auto" w:fill="FDF6DC"/>
+        </w:rPr>
+        <w:t>[visit]</w:t>
+      </w:r>
+      <w:r>
+        <w:t>.</w:t>
       </w:r>
     </w:p>
     <w:p>
@@ -754,51 +1323,9 @@
       </w:pPr>
       <w:r>
         <w:rPr>
-          <w:b w:val="0"/>
-        </w:rPr>
-        <w:t>Dear [Customer first name],</w:t>
-      </w:r>
-    </w:p>
-    <w:p>
-      <w:pPr>
-        <w:spacing w:after="200"/>
-      </w:pPr>
-      <w:r>
-        <w:rPr>
-          <w:b w:val="0"/>
-        </w:rPr>
-        <w:t>I'm writing to let you know about a change to our prices, and the reason for it.</w:t>
-      </w:r>
-    </w:p>
-    <w:p>
-      <w:pPr>
-        <w:spacing w:after="200"/>
-      </w:pPr>
-      <w:r>
-        <w:rPr>
-          <w:b w:val="0"/>
-        </w:rPr>
-        <w:t>Over the past [12 months], what we pay for [supplies, fuel, insurance or labor] has gone up. [Optional: name the cost, for example: Our fuel bill went from about (old amount) to (new amount) a month.] We have covered the difference ourselves until now, but to keep [the same products, crew and schedule] on every visit, we need to adjust.</w:t>
-      </w:r>
-    </w:p>
-    <w:p>
-      <w:pPr>
-        <w:spacing w:after="200"/>
-      </w:pPr>
-      <w:r>
-        <w:rPr>
-          <w:b w:val="0"/>
-        </w:rPr>
-        <w:t>Starting [effective date], your [service] will be [new price] per [visit], up from [old price]. That is [difference] more per [visit].</w:t>
-      </w:r>
-    </w:p>
-    <w:p>
-      <w:pPr>
-        <w:spacing w:after="200"/>
-      </w:pPr>
-      <w:r>
-        <w:rPr>
-          <w:b w:val="0"/>
+          <w:b/>
+          <w:color w:val="1F4E9E"/>
+          <w:shd w:val="clear" w:color="auto" w:fill="FDF6DC"/>
         </w:rPr>
         <w:t>[Optional: If (cost) comes back down, we will look at our prices again in (month).]</w:t>
       </w:r>
@@ -808,10 +1335,18 @@
         <w:spacing w:after="200"/>
       </w:pPr>
       <w:r>
+        <w:t xml:space="preserve">Questions? Call or text me at </w:t>
+      </w:r>
+      <w:r>
         <w:rPr>
-          <w:b w:val="0"/>
+          <w:b/>
+          <w:color w:val="1F4E9E"/>
+          <w:shd w:val="clear" w:color="auto" w:fill="FDF6DC"/>
         </w:rPr>
-        <w:t>Questions? Call or text me at [phone]. Thank you for sticking with us.</w:t>
+        <w:t>[phone]</w:t>
+      </w:r>
+      <w:r>
+        <w:t>. Thank you for sticking with us.</w:t>
       </w:r>
     </w:p>
     <w:p>
@@ -830,7 +1365,9 @@
       </w:pPr>
       <w:r>
         <w:rPr>
-          <w:b w:val="0"/>
+          <w:b/>
+          <w:color w:val="1F4E9E"/>
+          <w:shd w:val="clear" w:color="auto" w:fill="FDF6DC"/>
         </w:rPr>
         <w:t>[Your name]</w:t>
       </w:r>
@@ -841,7 +1378,9 @@
       </w:pPr>
       <w:r>
         <w:rPr>
-          <w:b w:val="0"/>
+          <w:b/>
+          <w:color w:val="1F4E9E"/>
+          <w:shd w:val="clear" w:color="auto" w:fill="FDF6DC"/>
         </w:rPr>
         <w:t>[Your business name]</w:t>
       </w:r>

</xml_diff>